<commit_message>
feat(redline): M9 execution service + API + integration tests; platform.docx adapters
</commit_message>
<xml_diff>
--- a/backend/src/test/resources/fixtures/m9-preexisting-revisions.docx
+++ b/backend/src/test/resources/fixtures/m9-preexisting-revisions.docx
@@ -19,11 +19,9 @@
       </w:r>
     </w:p>
     <w:p>
-      <w:ins w:id="900" w:author="Counterparty" w:date="2026-09-01T00:00:00Z">
-        <w:r>
-          <w:t>Supplier liability shall be unlimited.</w:t>
-        </w:r>
-      </w:ins>
+      <w:r>
+        <w:t xml:space="preserve">Supplier liability shall be unlimited.</w:t>
+      </w:r>
     </w:p>
     <w:p>
       <w:pPr>
@@ -34,9 +32,11 @@
       </w:r>
     </w:p>
     <w:p>
-      <w:r>
-        <w:t xml:space="preserve">This Agreement is governed by the laws of Delaware.</w:t>
-      </w:r>
+      <w:ins w:id="900" w:author="Counterparty" w:date="2026-09-01T00:00:00Z">
+        <w:r>
+          <w:t>This Agreement is governed by the laws of Delaware.</w:t>
+        </w:r>
+      </w:ins>
     </w:p>
     <w:sectPr/>
   </w:body>

</xml_diff>